<commit_message>
Regenerate mid-term submission doc v2 (evaluation fixes)
Co-Authored-By: Claude Fable 5 <noreply@anthropic.com>
</commit_message>
<xml_diff>
--- a/docs/S4-I-18_Subhiksha_Thirunavukkarasu_MidTermDoc.docx
+++ b/docs/S4-I-18_Subhiksha_Thirunavukkarasu_MidTermDoc.docx
@@ -4541,7 +4541,7 @@
         <w:br/>
         <w:drawing>
           <wp:inline xmlns:a="http://schemas.openxmlformats.org/drawingml/2006/main" xmlns:pic="http://schemas.openxmlformats.org/drawingml/2006/picture">
-            <wp:extent cx="5852160" cy="5120640"/>
+            <wp:extent cx="5852160" cy="5016137"/>
             <wp:docPr id="9" name="Picture 9"/>
             <wp:cNvGraphicFramePr>
               <a:graphicFrameLocks noChangeAspect="1"/>
@@ -4562,7 +4562,7 @@
                   <pic:spPr>
                     <a:xfrm>
                       <a:off x="0" y="0"/>
-                      <a:ext cx="5852160" cy="5120640"/>
+                      <a:ext cx="5852160" cy="5016137"/>
                     </a:xfrm>
                     <a:prstGeom prst="rect"/>
                   </pic:spPr>
@@ -4574,7 +4574,7 @@
         <w:br/>
         <w:drawing>
           <wp:inline xmlns:a="http://schemas.openxmlformats.org/drawingml/2006/main" xmlns:pic="http://schemas.openxmlformats.org/drawingml/2006/picture">
-            <wp:extent cx="5852160" cy="5120640"/>
+            <wp:extent cx="5852160" cy="5016137"/>
             <wp:docPr id="10" name="Picture 10"/>
             <wp:cNvGraphicFramePr>
               <a:graphicFrameLocks noChangeAspect="1"/>
@@ -4595,7 +4595,7 @@
                   <pic:spPr>
                     <a:xfrm>
                       <a:off x="0" y="0"/>
-                      <a:ext cx="5852160" cy="5120640"/>
+                      <a:ext cx="5852160" cy="5016137"/>
                     </a:xfrm>
                     <a:prstGeom prst="rect"/>
                   </pic:spPr>
@@ -4607,7 +4607,7 @@
         <w:br/>
         <w:drawing>
           <wp:inline xmlns:a="http://schemas.openxmlformats.org/drawingml/2006/main" xmlns:pic="http://schemas.openxmlformats.org/drawingml/2006/picture">
-            <wp:extent cx="5852160" cy="5120640"/>
+            <wp:extent cx="5852160" cy="5016137"/>
             <wp:docPr id="11" name="Picture 11"/>
             <wp:cNvGraphicFramePr>
               <a:graphicFrameLocks noChangeAspect="1"/>
@@ -4628,7 +4628,7 @@
                   <pic:spPr>
                     <a:xfrm>
                       <a:off x="0" y="0"/>
-                      <a:ext cx="5852160" cy="5120640"/>
+                      <a:ext cx="5852160" cy="5016137"/>
                     </a:xfrm>
                     <a:prstGeom prst="rect"/>
                   </pic:spPr>
@@ -5444,7 +5444,7 @@
           </w:tcPr>
           <w:p>
             <w:r>
-              <w:t>https://github.com/subhikshathirunavukkarasu0503/facilityiq  (private — L&amp;D: request access, or access granted on request within the review window)</w:t>
+              <w:t>https://github.com/subhikshathirunavukkarasu0503/facilityiq  (public — directly verifiable by L&amp;D)</w:t>
             </w:r>
           </w:p>
         </w:tc>
@@ -5504,7 +5504,7 @@
           </w:tcPr>
           <w:p>
             <w:r>
-              <w:t>9466e4d — 19-Jul-2026</w:t>
+              <w:t>ef8f542 — 19-Jul-2026 (evaluation fixes pushed post-review; original mid-term commit 9466e4d)</w:t>
             </w:r>
           </w:p>
         </w:tc>
@@ -5564,7 +5564,7 @@
           </w:tcPr>
           <w:p>
             <w:r>
-              <w:t>N/A (portal runs locally for mid-term; Azure App Service deployment is a Phase 2 item pending IT-created App Service plan)</w:t>
+              <w:t>https://facilityiq-subhiksha.streamlit.app  (Streamlit Community Cloud, free tier; Azure App Service pending IT-created plan)</w:t>
             </w:r>
           </w:p>
         </w:tc>
@@ -7710,6 +7710,58 @@
           </w:p>
         </w:tc>
       </w:tr>
+      <w:tr>
+        <w:tc>
+          <w:tcPr>
+            <w:tcW w:type="dxa" w:w="2400"/>
+          </w:tcPr>
+          <w:p>
+            <w:r>
+              <w:t>Groq API (L&amp;D approval condition)</w:t>
+            </w:r>
+          </w:p>
+        </w:tc>
+        <w:tc>
+          <w:tcPr>
+            <w:tcW w:type="dxa" w:w="1800"/>
+          </w:tcPr>
+          <w:p>
+            <w:r>
+              <w:t>Free tier / ₹0</w:t>
+            </w:r>
+          </w:p>
+        </w:tc>
+        <w:tc>
+          <w:tcPr>
+            <w:tcW w:type="dxa" w:w="1900"/>
+          </w:tcPr>
+          <w:p>
+            <w:r>
+              <w:t>☑ Yes  ☐ No  ☐ Partial</w:t>
+            </w:r>
+          </w:p>
+        </w:tc>
+        <w:tc>
+          <w:tcPr>
+            <w:tcW w:type="dxa" w:w="1300"/>
+          </w:tcPr>
+          <w:p>
+            <w:r>
+              <w:t>0</w:t>
+            </w:r>
+          </w:p>
+        </w:tc>
+        <w:tc>
+          <w:tcPr>
+            <w:tcW w:type="dxa" w:w="2346"/>
+          </w:tcPr>
+          <w:p>
+            <w:r>
+              <w:t>Added per the L&amp;D approval condition to include Groq alongside Gemini: second narrative provider (llama-3.3-70b-versatile) with a provider selector on the AI screen and automatic Gemini→Groq→cache→template failover.</w:t>
+            </w:r>
+          </w:p>
+        </w:tc>
+      </w:tr>
     </w:tbl>
     <w:p xmlns:wp14="http://schemas.microsoft.com/office/word/2010/wordml" wp14:textId="77777777">
       <w:pPr>
@@ -8513,6 +8565,48 @@
           <w:p>
             <w:r>
               <w:t>Google retired 2.5 Flash for newly created API keys (mid-2026); alias tracks the current free-tier flash model.</w:t>
+            </w:r>
+          </w:p>
+        </w:tc>
+      </w:tr>
+      <w:tr>
+        <w:tc>
+          <w:tcPr>
+            <w:tcW w:type="dxa" w:w="2100"/>
+          </w:tcPr>
+          <w:p>
+            <w:r>
+              <w:t>L&amp;D approval condition — Groq</w:t>
+            </w:r>
+          </w:p>
+        </w:tc>
+        <w:tc>
+          <w:tcPr>
+            <w:tcW w:type="dxa" w:w="2500"/>
+          </w:tcPr>
+          <w:p>
+            <w:r>
+              <w:t>Proposal listed Gemini (+ local Ollama); L&amp;D approval added the condition to include Groq</w:t>
+            </w:r>
+          </w:p>
+        </w:tc>
+        <w:tc>
+          <w:tcPr>
+            <w:tcW w:type="dxa" w:w="2500"/>
+          </w:tcPr>
+          <w:p>
+            <w:r>
+              <w:t>Groq integrated as a peer narrative provider: OpenAI-compatible REST client, llama-3.3-70b-versatile, provider picker on Screen 4, auto-failover Gemini→Groq→cache→template; unit tests cover the failover routing</w:t>
+            </w:r>
+          </w:p>
+        </w:tc>
+        <w:tc>
+          <w:tcPr>
+            <w:tcW w:type="dxa" w:w="2646"/>
+          </w:tcPr>
+          <w:p>
+            <w:r>
+              <w:t>Compliance with the L&amp;D approval condition (flagged at mid-term evaluation; resolved immediately after).</w:t>
             </w:r>
           </w:p>
         </w:tc>

</xml_diff>